<commit_message>
Administrative wording with SEBI circular number.
</commit_message>
<xml_diff>
--- a/2_Forwarding_Letter_EO_Bagchi.docx
+++ b/2_Forwarding_Letter_EO_Bagchi.docx
@@ -217,7 +217,7 @@
     </w:p>
     <w:p>
       <w:pPr>
-        <w:spacing w:before="40" w:after="120" w:lineRule="exact" w:line="320"/>
+        <w:spacing w:before="40" w:after="80" w:lineRule="exact" w:line="300"/>
         <w:jc w:val="both"/>
       </w:pPr>
       <w:r>
@@ -233,7 +233,7 @@
     </w:p>
     <w:p>
       <w:pPr>
-        <w:spacing w:before="0" w:after="120" w:lineRule="exact" w:line="310"/>
+        <w:spacing w:before="0" w:after="80" w:lineRule="exact" w:line="300"/>
         <w:jc w:val="both"/>
       </w:pPr>
       <w:r>
@@ -249,7 +249,7 @@
     </w:p>
     <w:p>
       <w:pPr>
-        <w:spacing w:before="0" w:after="120" w:lineRule="exact" w:line="310"/>
+        <w:spacing w:before="0" w:after="80" w:lineRule="exact" w:line="300"/>
         <w:jc w:val="both"/>
       </w:pPr>
       <w:r>
@@ -358,12 +358,6 @@
         </w:rPr>
         <w:t>5)  Enquiry proforma.</w:t>
       </w:r>
-    </w:p>
-    <w:p>
-      <w:pPr>
-        <w:spacing w:before="0" w:after="40" w:lineRule="exact" w:line="120"/>
-        <w:jc w:val="left"/>
-      </w:pPr>
     </w:p>
     <w:tbl>
       <w:tblPr>

</xml_diff>

<commit_message>
Add the office Ashoka emblem to the letterhead.
</commit_message>
<xml_diff>
--- a/2_Forwarding_Letter_EO_Bagchi.docx
+++ b/2_Forwarding_Letter_EO_Bagchi.docx
@@ -4,7 +4,47 @@
   <w:body>
     <w:p>
       <w:pPr>
-        <w:spacing w:before="0" w:after="0" w:lineRule="exact" w:line="340"/>
+        <w:spacing w:before="0" w:after="0" w:line="240" w:lineRule="auto"/>
+        <w:jc w:val="center"/>
+      </w:pPr>
+      <w:r>
+        <w:drawing>
+          <wp:inline xmlns:a="http://schemas.openxmlformats.org/drawingml/2006/main" xmlns:pic="http://schemas.openxmlformats.org/drawingml/2006/picture">
+            <wp:extent cx="457200" cy="468000"/>
+            <wp:docPr id="1" name="Picture 1"/>
+            <wp:cNvGraphicFramePr>
+              <a:graphicFrameLocks noChangeAspect="1"/>
+            </wp:cNvGraphicFramePr>
+            <a:graphic>
+              <a:graphicData uri="http://schemas.openxmlformats.org/drawingml/2006/picture">
+                <pic:pic>
+                  <pic:nvPicPr>
+                    <pic:cNvPr id="0" name="ashoka_emblem.jpg"/>
+                    <pic:cNvPicPr/>
+                  </pic:nvPicPr>
+                  <pic:blipFill>
+                    <a:blip r:embed="rId9"/>
+                    <a:stretch>
+                      <a:fillRect/>
+                    </a:stretch>
+                  </pic:blipFill>
+                  <pic:spPr>
+                    <a:xfrm>
+                      <a:off x="0" y="0"/>
+                      <a:ext cx="457200" cy="468000"/>
+                    </a:xfrm>
+                    <a:prstGeom prst="rect"/>
+                  </pic:spPr>
+                </pic:pic>
+              </a:graphicData>
+            </a:graphic>
+          </wp:inline>
+        </w:drawing>
+      </w:r>
+    </w:p>
+    <w:p>
+      <w:pPr>
+        <w:spacing w:before="40" w:after="0" w:lineRule="exact" w:line="320"/>
         <w:jc w:val="center"/>
       </w:pPr>
       <w:r>
@@ -20,7 +60,7 @@
     </w:p>
     <w:p>
       <w:pPr>
-        <w:spacing w:before="0" w:after="0" w:lineRule="exact" w:line="360"/>
+        <w:spacing w:before="0" w:after="0" w:lineRule="exact" w:line="320"/>
         <w:jc w:val="center"/>
       </w:pPr>
       <w:r>
@@ -29,14 +69,14 @@
           <w:b/>
           <w:i w:val="0"/>
           <w:color w:val="000000"/>
-          <w:sz w:val="30"/>
+          <w:sz w:val="28"/>
         </w:rPr>
-        <w:t>Office of the Sub-Divisional Officer</w:t>
+        <w:t>Office of the Sub-Divisional Officer,</w:t>
       </w:r>
     </w:p>
     <w:p>
       <w:pPr>
-        <w:spacing w:before="0" w:after="0" w:lineRule="exact" w:line="320"/>
+        <w:spacing w:before="0" w:after="0" w:lineRule="exact" w:line="300"/>
         <w:jc w:val="center"/>
       </w:pPr>
       <w:r>
@@ -52,7 +92,7 @@
     </w:p>
     <w:p>
       <w:pPr>
-        <w:spacing w:before="0" w:after="20" w:lineRule="exact" w:line="260"/>
+        <w:spacing w:before="0" w:after="0" w:lineRule="exact" w:line="260"/>
         <w:jc w:val="center"/>
       </w:pPr>
       <w:r>
@@ -63,12 +103,12 @@
           <w:color w:val="000000"/>
           <w:sz w:val="20"/>
         </w:rPr>
-        <w:t>e-mail Id- sdmbalurghat@gmail.com   &amp;   Ph. No.- 03522-255205</w:t>
+        <w:t>e-mail Id- sdmbalurghat@gmail.com  &amp;  Ph. No.-03522 255205</w:t>
       </w:r>
     </w:p>
     <w:p>
       <w:pPr>
-        <w:spacing w:before="0" w:after="60" w:lineRule="exact" w:line="80"/>
+        <w:spacing w:before="0" w:after="40" w:lineRule="exact" w:line="60"/>
         <w:jc w:val="left"/>
         <w:pBdr>
           <w:bottom w:val="single" w:sz="12" w:space="1" w:color="000000"/>

</xml_diff>